<commit_message>
docs: ERS 2.1 y cobertura de pruebas 2.0
Co-Authored-By: Claude Sonnet 5.5 <noreply@anthropic.com>
Claude-Session: https://claude.ai/code/session_014SgzzRtuwqNgBn3A5wQqMA
</commit_message>
<xml_diff>
--- a/docs/Cobertura-de-pruebas-ClothesRecovery.docx
+++ b/docs/Cobertura-de-pruebas-ClothesRecovery.docx
@@ -17,7 +17,7 @@
     </w:p>
     <w:p>
       <w:r>
-        <w:t>Autor: Vicente Flores (sección 001D)    Fecha: 26-10-2026    Versión: 1.0</w:t>
+        <w:t>Autor: Vicente Flores (sección 001D)    Fecha: 26-10-2026    Versión: 2.0</w:t>
       </w:r>
     </w:p>
     <w:p>
@@ -35,7 +35,7 @@
     </w:p>
     <w:p>
       <w:r>
-        <w:t>Qué se probó: la base de datos simulada (productos, usuarios, pedidos, blogs, categorías y zonas), el contexto del carrito, y los componentes ProductoCard, Login, Contacto y CompraResultado. Qué no se probó: el resto de las vistas y componentes (ver la sección 6). La cobertura porcentual de este documento se mide solo sobre los archivos que cargan las pruebas.</w:t>
+        <w:t>Qué se probó: la base de datos simulada (productos, usuarios, pedidos, blogs, categorías y zonas), los contextos del carrito y de la sesión, los componentes Navbar, ProductoCard y DireccionFields, y las vistas Productos, Ofertas, Login, Contacto, Comprar y CompraResultado. Qué no se probó: el resto de las vistas y componentes (ver la sección 7). La cobertura porcentual de este documento se mide solo sobre los archivos que cargan las pruebas.</w:t>
       </w:r>
     </w:p>
     <w:p>
@@ -118,7 +118,7 @@
               <w:rPr>
                 <w:sz w:val="20"/>
               </w:rPr>
-              <w:t>Escribir las pruebas: describe agrupa, it es un caso y expect compara el resultado.</w:t>
+              <w:t>Escribir las pruebas: describe agrupa, it es un caso y expect compara el resultado. También entrega los mocks (jasmine.createSpy y spyOn).</w:t>
             </w:r>
           </w:p>
         </w:tc>
@@ -345,7 +345,7 @@
               <w:rPr>
                 <w:sz w:val="20"/>
               </w:rPr>
-              <w:t>10</w:t>
+              <w:t>15</w:t>
             </w:r>
           </w:p>
         </w:tc>
@@ -375,7 +375,7 @@
               <w:rPr>
                 <w:sz w:val="20"/>
               </w:rPr>
-              <w:t>91</w:t>
+              <w:t>144</w:t>
             </w:r>
           </w:p>
         </w:tc>
@@ -405,7 +405,7 @@
               <w:rPr>
                 <w:sz w:val="20"/>
               </w:rPr>
-              <w:t>91</w:t>
+              <w:t>144</w:t>
             </w:r>
           </w:p>
         </w:tc>
@@ -452,7 +452,7 @@
     </w:p>
     <w:p>
       <w:r>
-        <w:t>Porcentajes medidos sobre los 11 archivos que cargan las pruebas:</w:t>
+        <w:t>Porcentajes medidos sobre los 17 archivos que cargan las pruebas:</w:t>
       </w:r>
     </w:p>
     <w:tbl>
@@ -548,7 +548,7 @@
               <w:rPr>
                 <w:sz w:val="20"/>
               </w:rPr>
-              <w:t>245 / 250</w:t>
+              <w:t>358 / 361</w:t>
             </w:r>
           </w:p>
         </w:tc>
@@ -565,7 +565,7 @@
               <w:rPr>
                 <w:sz w:val="20"/>
               </w:rPr>
-              <w:t>98,00 %</w:t>
+              <w:t>99,16 %</w:t>
             </w:r>
           </w:p>
         </w:tc>
@@ -598,7 +598,7 @@
               <w:rPr>
                 <w:sz w:val="20"/>
               </w:rPr>
-              <w:t>90 / 97</w:t>
+              <w:t>144 / 157</w:t>
             </w:r>
           </w:p>
         </w:tc>
@@ -615,7 +615,7 @@
               <w:rPr>
                 <w:sz w:val="20"/>
               </w:rPr>
-              <w:t>92,78 %</w:t>
+              <w:t>91,71 %</w:t>
             </w:r>
           </w:p>
         </w:tc>
@@ -648,7 +648,7 @@
               <w:rPr>
                 <w:sz w:val="20"/>
               </w:rPr>
-              <w:t>57 / 59</w:t>
+              <w:t>96 / 96</w:t>
             </w:r>
           </w:p>
         </w:tc>
@@ -665,7 +665,7 @@
               <w:rPr>
                 <w:sz w:val="20"/>
               </w:rPr>
-              <w:t>96,61 %</w:t>
+              <w:t>100 %</w:t>
             </w:r>
           </w:p>
         </w:tc>
@@ -698,7 +698,7 @@
               <w:rPr>
                 <w:sz w:val="20"/>
               </w:rPr>
-              <w:t>221 / 226</w:t>
+              <w:t>328 / 331</w:t>
             </w:r>
           </w:p>
         </w:tc>
@@ -715,7 +715,7 @@
               <w:rPr>
                 <w:sz w:val="20"/>
               </w:rPr>
-              <w:t>97,78 %</w:t>
+              <w:t>99,09 %</w:t>
             </w:r>
           </w:p>
         </w:tc>
@@ -841,7 +841,203 @@
                 <w:color w:val="FFFFFF"/>
                 <w:sz w:val="20"/>
               </w:rPr>
-              <w:t>Líneas sin cubrir</w:t>
+              <w:t>Sin cubrir</w:t>
+            </w:r>
+          </w:p>
+        </w:tc>
+      </w:tr>
+      <w:tr>
+        <w:tc>
+          <w:tcPr>
+            <w:tcW w:type="dxa" w:w="3175"/>
+          </w:tcPr>
+          <w:p>
+            <w:r/>
+            <w:r>
+              <w:rPr>
+                <w:sz w:val="20"/>
+              </w:rPr>
+              <w:t>components/DireccionFields.jsx</w:t>
+            </w:r>
+          </w:p>
+        </w:tc>
+        <w:tc>
+          <w:tcPr>
+            <w:tcW w:type="dxa" w:w="1191"/>
+          </w:tcPr>
+          <w:p>
+            <w:pPr>
+              <w:jc w:val="right"/>
+            </w:pPr>
+            <w:r/>
+            <w:r>
+              <w:rPr>
+                <w:sz w:val="20"/>
+              </w:rPr>
+              <w:t>100</w:t>
+            </w:r>
+          </w:p>
+        </w:tc>
+        <w:tc>
+          <w:tcPr>
+            <w:tcW w:type="dxa" w:w="1020"/>
+          </w:tcPr>
+          <w:p>
+            <w:pPr>
+              <w:jc w:val="right"/>
+            </w:pPr>
+            <w:r/>
+            <w:r>
+              <w:rPr>
+                <w:sz w:val="20"/>
+              </w:rPr>
+              <w:t>100</w:t>
+            </w:r>
+          </w:p>
+        </w:tc>
+        <w:tc>
+          <w:tcPr>
+            <w:tcW w:type="dxa" w:w="1247"/>
+          </w:tcPr>
+          <w:p>
+            <w:pPr>
+              <w:jc w:val="right"/>
+            </w:pPr>
+            <w:r/>
+            <w:r>
+              <w:rPr>
+                <w:sz w:val="20"/>
+              </w:rPr>
+              <w:t>100</w:t>
+            </w:r>
+          </w:p>
+        </w:tc>
+        <w:tc>
+          <w:tcPr>
+            <w:tcW w:type="dxa" w:w="1020"/>
+          </w:tcPr>
+          <w:p>
+            <w:pPr>
+              <w:jc w:val="right"/>
+            </w:pPr>
+            <w:r/>
+            <w:r>
+              <w:rPr>
+                <w:sz w:val="20"/>
+              </w:rPr>
+              <w:t>100</w:t>
+            </w:r>
+          </w:p>
+        </w:tc>
+        <w:tc>
+          <w:tcPr>
+            <w:tcW w:type="dxa" w:w="1701"/>
+          </w:tcPr>
+          <w:p>
+            <w:r/>
+            <w:r>
+              <w:rPr>
+                <w:sz w:val="20"/>
+              </w:rPr>
+              <w:t>—</w:t>
+            </w:r>
+          </w:p>
+        </w:tc>
+      </w:tr>
+      <w:tr>
+        <w:tc>
+          <w:tcPr>
+            <w:tcW w:type="dxa" w:w="3175"/>
+          </w:tcPr>
+          <w:p>
+            <w:r/>
+            <w:r>
+              <w:rPr>
+                <w:sz w:val="20"/>
+              </w:rPr>
+              <w:t>components/Navbar.jsx</w:t>
+            </w:r>
+          </w:p>
+        </w:tc>
+        <w:tc>
+          <w:tcPr>
+            <w:tcW w:type="dxa" w:w="1191"/>
+          </w:tcPr>
+          <w:p>
+            <w:pPr>
+              <w:jc w:val="right"/>
+            </w:pPr>
+            <w:r/>
+            <w:r>
+              <w:rPr>
+                <w:sz w:val="20"/>
+              </w:rPr>
+              <w:t>100</w:t>
+            </w:r>
+          </w:p>
+        </w:tc>
+        <w:tc>
+          <w:tcPr>
+            <w:tcW w:type="dxa" w:w="1020"/>
+          </w:tcPr>
+          <w:p>
+            <w:pPr>
+              <w:jc w:val="right"/>
+            </w:pPr>
+            <w:r/>
+            <w:r>
+              <w:rPr>
+                <w:sz w:val="20"/>
+              </w:rPr>
+              <w:t>87,5</w:t>
+            </w:r>
+          </w:p>
+        </w:tc>
+        <w:tc>
+          <w:tcPr>
+            <w:tcW w:type="dxa" w:w="1247"/>
+          </w:tcPr>
+          <w:p>
+            <w:pPr>
+              <w:jc w:val="right"/>
+            </w:pPr>
+            <w:r/>
+            <w:r>
+              <w:rPr>
+                <w:sz w:val="20"/>
+              </w:rPr>
+              <w:t>100</w:t>
+            </w:r>
+          </w:p>
+        </w:tc>
+        <w:tc>
+          <w:tcPr>
+            <w:tcW w:type="dxa" w:w="1020"/>
+          </w:tcPr>
+          <w:p>
+            <w:pPr>
+              <w:jc w:val="right"/>
+            </w:pPr>
+            <w:r/>
+            <w:r>
+              <w:rPr>
+                <w:sz w:val="20"/>
+              </w:rPr>
+              <w:t>100</w:t>
+            </w:r>
+          </w:p>
+        </w:tc>
+        <w:tc>
+          <w:tcPr>
+            <w:tcW w:type="dxa" w:w="1701"/>
+          </w:tcPr>
+          <w:p>
+            <w:r/>
+            <w:r>
+              <w:rPr>
+                <w:sz w:val="20"/>
+              </w:rPr>
+              <w:t>112 (rama)</w:t>
             </w:r>
           </w:p>
         </w:tc>
@@ -1038,6 +1234,104 @@
                 <w:sz w:val="20"/>
               </w:rPr>
               <w:t>95</w:t>
+            </w:r>
+          </w:p>
+        </w:tc>
+      </w:tr>
+      <w:tr>
+        <w:tc>
+          <w:tcPr>
+            <w:tcW w:type="dxa" w:w="3175"/>
+          </w:tcPr>
+          <w:p>
+            <w:r/>
+            <w:r>
+              <w:rPr>
+                <w:sz w:val="20"/>
+              </w:rPr>
+              <w:t>context/SesionContext.jsx</w:t>
+            </w:r>
+          </w:p>
+        </w:tc>
+        <w:tc>
+          <w:tcPr>
+            <w:tcW w:type="dxa" w:w="1191"/>
+          </w:tcPr>
+          <w:p>
+            <w:pPr>
+              <w:jc w:val="right"/>
+            </w:pPr>
+            <w:r/>
+            <w:r>
+              <w:rPr>
+                <w:sz w:val="20"/>
+              </w:rPr>
+              <w:t>100</w:t>
+            </w:r>
+          </w:p>
+        </w:tc>
+        <w:tc>
+          <w:tcPr>
+            <w:tcW w:type="dxa" w:w="1020"/>
+          </w:tcPr>
+          <w:p>
+            <w:pPr>
+              <w:jc w:val="right"/>
+            </w:pPr>
+            <w:r/>
+            <w:r>
+              <w:rPr>
+                <w:sz w:val="20"/>
+              </w:rPr>
+              <w:t>100</w:t>
+            </w:r>
+          </w:p>
+        </w:tc>
+        <w:tc>
+          <w:tcPr>
+            <w:tcW w:type="dxa" w:w="1247"/>
+          </w:tcPr>
+          <w:p>
+            <w:pPr>
+              <w:jc w:val="right"/>
+            </w:pPr>
+            <w:r/>
+            <w:r>
+              <w:rPr>
+                <w:sz w:val="20"/>
+              </w:rPr>
+              <w:t>100</w:t>
+            </w:r>
+          </w:p>
+        </w:tc>
+        <w:tc>
+          <w:tcPr>
+            <w:tcW w:type="dxa" w:w="1020"/>
+          </w:tcPr>
+          <w:p>
+            <w:pPr>
+              <w:jc w:val="right"/>
+            </w:pPr>
+            <w:r/>
+            <w:r>
+              <w:rPr>
+                <w:sz w:val="20"/>
+              </w:rPr>
+              <w:t>100</w:t>
+            </w:r>
+          </w:p>
+        </w:tc>
+        <w:tc>
+          <w:tcPr>
+            <w:tcW w:type="dxa" w:w="1701"/>
+          </w:tcPr>
+          <w:p>
+            <w:r/>
+            <w:r>
+              <w:rPr>
+                <w:sz w:val="20"/>
+              </w:rPr>
+              <w:t>—</w:t>
             </w:r>
           </w:p>
         </w:tc>
@@ -1658,7 +1952,7 @@
               <w:rPr>
                 <w:sz w:val="20"/>
               </w:rPr>
-              <w:t>83,33</w:t>
+              <w:t>100</w:t>
             </w:r>
           </w:p>
         </w:tc>
@@ -1675,7 +1969,7 @@
               <w:rPr>
                 <w:sz w:val="20"/>
               </w:rPr>
-              <w:t>94,44</w:t>
+              <w:t>100</w:t>
             </w:r>
           </w:p>
         </w:tc>
@@ -1692,7 +1986,7 @@
               <w:rPr>
                 <w:sz w:val="20"/>
               </w:rPr>
-              <w:t>50</w:t>
+              <w:t>100</w:t>
             </w:r>
           </w:p>
         </w:tc>
@@ -1709,7 +2003,7 @@
               <w:rPr>
                 <w:sz w:val="20"/>
               </w:rPr>
-              <w:t>83,33</w:t>
+              <w:t>100</w:t>
             </w:r>
           </w:p>
         </w:tc>
@@ -1723,7 +2017,105 @@
               <w:rPr>
                 <w:sz w:val="20"/>
               </w:rPr>
-              <w:t>134-140</w:t>
+              <w:t>—</w:t>
+            </w:r>
+          </w:p>
+        </w:tc>
+      </w:tr>
+      <w:tr>
+        <w:tc>
+          <w:tcPr>
+            <w:tcW w:type="dxa" w:w="3175"/>
+          </w:tcPr>
+          <w:p>
+            <w:r/>
+            <w:r>
+              <w:rPr>
+                <w:sz w:val="20"/>
+              </w:rPr>
+              <w:t>pages/Comprar.jsx</w:t>
+            </w:r>
+          </w:p>
+        </w:tc>
+        <w:tc>
+          <w:tcPr>
+            <w:tcW w:type="dxa" w:w="1191"/>
+          </w:tcPr>
+          <w:p>
+            <w:pPr>
+              <w:jc w:val="right"/>
+            </w:pPr>
+            <w:r/>
+            <w:r>
+              <w:rPr>
+                <w:sz w:val="20"/>
+              </w:rPr>
+              <w:t>100</w:t>
+            </w:r>
+          </w:p>
+        </w:tc>
+        <w:tc>
+          <w:tcPr>
+            <w:tcW w:type="dxa" w:w="1020"/>
+          </w:tcPr>
+          <w:p>
+            <w:pPr>
+              <w:jc w:val="right"/>
+            </w:pPr>
+            <w:r/>
+            <w:r>
+              <w:rPr>
+                <w:sz w:val="20"/>
+              </w:rPr>
+              <w:t>76,92</w:t>
+            </w:r>
+          </w:p>
+        </w:tc>
+        <w:tc>
+          <w:tcPr>
+            <w:tcW w:type="dxa" w:w="1247"/>
+          </w:tcPr>
+          <w:p>
+            <w:pPr>
+              <w:jc w:val="right"/>
+            </w:pPr>
+            <w:r/>
+            <w:r>
+              <w:rPr>
+                <w:sz w:val="20"/>
+              </w:rPr>
+              <w:t>100</w:t>
+            </w:r>
+          </w:p>
+        </w:tc>
+        <w:tc>
+          <w:tcPr>
+            <w:tcW w:type="dxa" w:w="1020"/>
+          </w:tcPr>
+          <w:p>
+            <w:pPr>
+              <w:jc w:val="right"/>
+            </w:pPr>
+            <w:r/>
+            <w:r>
+              <w:rPr>
+                <w:sz w:val="20"/>
+              </w:rPr>
+              <w:t>100</w:t>
+            </w:r>
+          </w:p>
+        </w:tc>
+        <w:tc>
+          <w:tcPr>
+            <w:tcW w:type="dxa" w:w="1701"/>
+          </w:tcPr>
+          <w:p>
+            <w:r/>
+            <w:r>
+              <w:rPr>
+                <w:sz w:val="20"/>
+              </w:rPr>
+              <w:t>19-28 (ramas)</w:t>
             </w:r>
           </w:p>
         </w:tc>
@@ -1924,6 +2316,202 @@
           </w:p>
         </w:tc>
       </w:tr>
+      <w:tr>
+        <w:tc>
+          <w:tcPr>
+            <w:tcW w:type="dxa" w:w="3175"/>
+          </w:tcPr>
+          <w:p>
+            <w:r/>
+            <w:r>
+              <w:rPr>
+                <w:sz w:val="20"/>
+              </w:rPr>
+              <w:t>pages/Ofertas.jsx</w:t>
+            </w:r>
+          </w:p>
+        </w:tc>
+        <w:tc>
+          <w:tcPr>
+            <w:tcW w:type="dxa" w:w="1191"/>
+          </w:tcPr>
+          <w:p>
+            <w:pPr>
+              <w:jc w:val="right"/>
+            </w:pPr>
+            <w:r/>
+            <w:r>
+              <w:rPr>
+                <w:sz w:val="20"/>
+              </w:rPr>
+              <w:t>100</w:t>
+            </w:r>
+          </w:p>
+        </w:tc>
+        <w:tc>
+          <w:tcPr>
+            <w:tcW w:type="dxa" w:w="1020"/>
+          </w:tcPr>
+          <w:p>
+            <w:pPr>
+              <w:jc w:val="right"/>
+            </w:pPr>
+            <w:r/>
+            <w:r>
+              <w:rPr>
+                <w:sz w:val="20"/>
+              </w:rPr>
+              <w:t>100</w:t>
+            </w:r>
+          </w:p>
+        </w:tc>
+        <w:tc>
+          <w:tcPr>
+            <w:tcW w:type="dxa" w:w="1247"/>
+          </w:tcPr>
+          <w:p>
+            <w:pPr>
+              <w:jc w:val="right"/>
+            </w:pPr>
+            <w:r/>
+            <w:r>
+              <w:rPr>
+                <w:sz w:val="20"/>
+              </w:rPr>
+              <w:t>100</w:t>
+            </w:r>
+          </w:p>
+        </w:tc>
+        <w:tc>
+          <w:tcPr>
+            <w:tcW w:type="dxa" w:w="1020"/>
+          </w:tcPr>
+          <w:p>
+            <w:pPr>
+              <w:jc w:val="right"/>
+            </w:pPr>
+            <w:r/>
+            <w:r>
+              <w:rPr>
+                <w:sz w:val="20"/>
+              </w:rPr>
+              <w:t>100</w:t>
+            </w:r>
+          </w:p>
+        </w:tc>
+        <w:tc>
+          <w:tcPr>
+            <w:tcW w:type="dxa" w:w="1701"/>
+          </w:tcPr>
+          <w:p>
+            <w:r/>
+            <w:r>
+              <w:rPr>
+                <w:sz w:val="20"/>
+              </w:rPr>
+              <w:t>—</w:t>
+            </w:r>
+          </w:p>
+        </w:tc>
+      </w:tr>
+      <w:tr>
+        <w:tc>
+          <w:tcPr>
+            <w:tcW w:type="dxa" w:w="3175"/>
+          </w:tcPr>
+          <w:p>
+            <w:r/>
+            <w:r>
+              <w:rPr>
+                <w:sz w:val="20"/>
+              </w:rPr>
+              <w:t>pages/Productos.jsx</w:t>
+            </w:r>
+          </w:p>
+        </w:tc>
+        <w:tc>
+          <w:tcPr>
+            <w:tcW w:type="dxa" w:w="1191"/>
+          </w:tcPr>
+          <w:p>
+            <w:pPr>
+              <w:jc w:val="right"/>
+            </w:pPr>
+            <w:r/>
+            <w:r>
+              <w:rPr>
+                <w:sz w:val="20"/>
+              </w:rPr>
+              <w:t>100</w:t>
+            </w:r>
+          </w:p>
+        </w:tc>
+        <w:tc>
+          <w:tcPr>
+            <w:tcW w:type="dxa" w:w="1020"/>
+          </w:tcPr>
+          <w:p>
+            <w:pPr>
+              <w:jc w:val="right"/>
+            </w:pPr>
+            <w:r/>
+            <w:r>
+              <w:rPr>
+                <w:sz w:val="20"/>
+              </w:rPr>
+              <w:t>100</w:t>
+            </w:r>
+          </w:p>
+        </w:tc>
+        <w:tc>
+          <w:tcPr>
+            <w:tcW w:type="dxa" w:w="1247"/>
+          </w:tcPr>
+          <w:p>
+            <w:pPr>
+              <w:jc w:val="right"/>
+            </w:pPr>
+            <w:r/>
+            <w:r>
+              <w:rPr>
+                <w:sz w:val="20"/>
+              </w:rPr>
+              <w:t>100</w:t>
+            </w:r>
+          </w:p>
+        </w:tc>
+        <w:tc>
+          <w:tcPr>
+            <w:tcW w:type="dxa" w:w="1020"/>
+          </w:tcPr>
+          <w:p>
+            <w:pPr>
+              <w:jc w:val="right"/>
+            </w:pPr>
+            <w:r/>
+            <w:r>
+              <w:rPr>
+                <w:sz w:val="20"/>
+              </w:rPr>
+              <w:t>100</w:t>
+            </w:r>
+          </w:p>
+        </w:tc>
+        <w:tc>
+          <w:tcPr>
+            <w:tcW w:type="dxa" w:w="1701"/>
+          </w:tcPr>
+          <w:p>
+            <w:r/>
+            <w:r>
+              <w:rPr>
+                <w:sz w:val="20"/>
+              </w:rPr>
+              <w:t>—</w:t>
+            </w:r>
+          </w:p>
+        </w:tc>
+      </w:tr>
     </w:tbl>
     <w:p/>
     <w:p>
@@ -1931,7 +2519,49 @@
         <w:pStyle w:val="Heading1"/>
       </w:pPr>
       <w:r>
-        <w:t>5. Pruebas por archivo</w:t>
+        <w:t>5. Uso de mocks</w:t>
+      </w:r>
+    </w:p>
+    <w:p>
+      <w:r>
+        <w:t>Para aislar cada pieza se usan los espías (mocks) de Jasmine:</w:t>
+      </w:r>
+    </w:p>
+    <w:p>
+      <w:pPr>
+        <w:pStyle w:val="ListBullet"/>
+      </w:pPr>
+      <w:r>
+        <w:t>jasmine.createSpy: simula funciones que un componente recibe por props. Por ejemplo, en ProductoCard se pasa un espía como onAgregar y se verifica que el clic lo llame con el producto y el precio que se cobra; en DireccionFields se verifican los cambios de región y comuna.</w:t>
+      </w:r>
+    </w:p>
+    <w:p>
+      <w:pPr>
+        <w:pStyle w:val="ListBullet"/>
+      </w:pPr>
+      <w:r>
+        <w:t>spyOn(Storage.prototype, "setItem"): vigila el guardado en localStorage. Con callThrough se comprueba que el carrito y los pedidos se guardan; con throwError se simula que el almacenamiento falla y se verifica que la aplicación no se cae.</w:t>
+      </w:r>
+    </w:p>
+    <w:p>
+      <w:pPr>
+        <w:pStyle w:val="ListBullet"/>
+      </w:pPr>
+      <w:r>
+        <w:t>spyOn(window, "print"): reemplaza la impresión del navegador para comprobar que el botón "Imprimir boleta en PDF" la invoca sin abrir el diálogo real.</w:t>
+      </w:r>
+    </w:p>
+    <w:p>
+      <w:r>
+        <w:t>Después de cada prueba los espías se restauran y el localStorage se limpia, para que las pruebas no dependan unas de otras.</w:t>
+      </w:r>
+    </w:p>
+    <w:p>
+      <w:pPr>
+        <w:pStyle w:val="Heading1"/>
+      </w:pPr>
+      <w:r>
+        <w:t>6. Pruebas por archivo</w:t>
       </w:r>
     </w:p>
     <w:tbl>
@@ -2024,7 +2654,7 @@
               <w:rPr>
                 <w:sz w:val="20"/>
               </w:rPr>
-              <w:t>22</w:t>
+              <w:t>29</w:t>
             </w:r>
           </w:p>
         </w:tc>
@@ -2038,7 +2668,7 @@
               <w:rPr>
                 <w:sz w:val="20"/>
               </w:rPr>
-              <w:t>Formato de precio; ofertas (20 %, redondeo, precio final); leer por código y por categoría; crear, editar y eliminar productos; descontar stock.</w:t>
+              <w:t>Formato de precio; ofertas (20 %, redondeo, precio final); leer por código y por categoría; buscarProductos por texto y categoría; crear, editar y eliminar productos; descontar stock.</w:t>
             </w:r>
           </w:p>
         </w:tc>
@@ -2068,7 +2698,7 @@
               <w:rPr>
                 <w:sz w:val="20"/>
               </w:rPr>
-              <w:t>13</w:t>
+              <w:t>15</w:t>
             </w:r>
           </w:p>
         </w:tc>
@@ -2082,7 +2712,7 @@
               <w:rPr>
                 <w:sz w:val="20"/>
               </w:rPr>
-              <w:t>Pasarela simulada (acepta hasta $150.000 inclusive y rechaza sobre ese monto); crear pedido con número y código de orden; copia de ítems; localStorage; leer, editar y eliminar.</w:t>
+              <w:t>Pasarela simulada (acepta hasta $150.000 inclusive y rechaza sobre ese monto); crear pedido con número y código de orden; copia de ítems; localStorage (con mocks); leer, editar y eliminar.</w:t>
             </w:r>
           </w:p>
         </w:tc>
@@ -2112,7 +2742,7 @@
               <w:rPr>
                 <w:sz w:val="20"/>
               </w:rPr>
-              <w:t>11</w:t>
+              <w:t>13</w:t>
             </w:r>
           </w:p>
         </w:tc>
@@ -2126,7 +2756,7 @@
               <w:rPr>
                 <w:sz w:val="20"/>
               </w:rPr>
-              <w:t>Carrito vacío; agregar y sumar cantidades; tope de stock; producto inexistente; cambiar cantidad; eliminar; vaciar; guardar y recuperar desde localStorage.</w:t>
+              <w:t>Carrito vacío; agregar y sumar cantidades; tope de stock; producto inexistente; cambiar cantidad; eliminar; vaciar; guardar y recuperar desde localStorage, incluso cuando el guardado falla.</w:t>
             </w:r>
           </w:p>
         </w:tc>
@@ -2230,6 +2860,226 @@
               <w:rPr>
                 <w:sz w:val="20"/>
               </w:rPr>
+              <w:t>pages/Productos.spec.jsx</w:t>
+            </w:r>
+          </w:p>
+        </w:tc>
+        <w:tc>
+          <w:tcPr>
+            <w:tcW w:type="dxa" w:w="680"/>
+          </w:tcPr>
+          <w:p>
+            <w:r/>
+            <w:r>
+              <w:rPr>
+                <w:sz w:val="20"/>
+              </w:rPr>
+              <w:t>10</w:t>
+            </w:r>
+          </w:p>
+        </w:tc>
+        <w:tc>
+          <w:tcPr>
+            <w:tcW w:type="dxa" w:w="5669"/>
+          </w:tcPr>
+          <w:p>
+            <w:r/>
+            <w:r>
+              <w:rPr>
+                <w:sz w:val="20"/>
+              </w:rPr>
+              <w:t>Listado completo; búsqueda por texto sin distinguir mayúsculas; filtro por categoría; combinación de ambos; filtros en la URL; botón Limpiar; contador; mensaje sin resultados; vista de Ofertas.</w:t>
+            </w:r>
+          </w:p>
+        </w:tc>
+      </w:tr>
+      <w:tr>
+        <w:tc>
+          <w:tcPr>
+            <w:tcW w:type="dxa" w:w="3061"/>
+          </w:tcPr>
+          <w:p>
+            <w:r/>
+            <w:r>
+              <w:rPr>
+                <w:sz w:val="20"/>
+              </w:rPr>
+              <w:t>pages/Comprar.spec.jsx</w:t>
+            </w:r>
+          </w:p>
+        </w:tc>
+        <w:tc>
+          <w:tcPr>
+            <w:tcW w:type="dxa" w:w="680"/>
+          </w:tcPr>
+          <w:p>
+            <w:r/>
+            <w:r>
+              <w:rPr>
+                <w:sz w:val="20"/>
+              </w:rPr>
+              <w:t>9</w:t>
+            </w:r>
+          </w:p>
+        </w:tc>
+        <w:tc>
+          <w:tcPr>
+            <w:tcW w:type="dxa" w:w="5669"/>
+          </w:tcPr>
+          <w:p>
+            <w:r/>
+            <w:r>
+              <w:rPr>
+                <w:sz w:val="20"/>
+              </w:rPr>
+              <w:t>Carrito vacío; formulario vacío sin sesión; formulario completado con la sesión; total en el botón; escritura en el formulario; pago aceptado, rechazado por monto y rechazado por stock; datos del pedido.</w:t>
+            </w:r>
+          </w:p>
+        </w:tc>
+      </w:tr>
+      <w:tr>
+        <w:tc>
+          <w:tcPr>
+            <w:tcW w:type="dxa" w:w="3061"/>
+          </w:tcPr>
+          <w:p>
+            <w:r/>
+            <w:r>
+              <w:rPr>
+                <w:sz w:val="20"/>
+              </w:rPr>
+              <w:t>pages/CompraResultado.spec.jsx</w:t>
+            </w:r>
+          </w:p>
+        </w:tc>
+        <w:tc>
+          <w:tcPr>
+            <w:tcW w:type="dxa" w:w="680"/>
+          </w:tcPr>
+          <w:p>
+            <w:r/>
+            <w:r>
+              <w:rPr>
+                <w:sz w:val="20"/>
+              </w:rPr>
+              <w:t>8</w:t>
+            </w:r>
+          </w:p>
+        </w:tc>
+        <w:tc>
+          <w:tcPr>
+            <w:tcW w:type="dxa" w:w="5669"/>
+          </w:tcPr>
+          <w:p>
+            <w:r/>
+            <w:r>
+              <w:rPr>
+                <w:sz w:val="20"/>
+              </w:rPr>
+              <w:t>Vista de compra exitosa y de error; motivo del rechazo (monto o stock); datos del cliente y producto; pedido no encontrado; botón de impresión (mock de window.print); mensaje de envío por email.</w:t>
+            </w:r>
+          </w:p>
+        </w:tc>
+      </w:tr>
+      <w:tr>
+        <w:tc>
+          <w:tcPr>
+            <w:tcW w:type="dxa" w:w="3061"/>
+          </w:tcPr>
+          <w:p>
+            <w:r/>
+            <w:r>
+              <w:rPr>
+                <w:sz w:val="20"/>
+              </w:rPr>
+              <w:t>components/Navbar.spec.jsx</w:t>
+            </w:r>
+          </w:p>
+        </w:tc>
+        <w:tc>
+          <w:tcPr>
+            <w:tcW w:type="dxa" w:w="680"/>
+          </w:tcPr>
+          <w:p>
+            <w:r/>
+            <w:r>
+              <w:rPr>
+                <w:sz w:val="20"/>
+              </w:rPr>
+              <w:t>8</w:t>
+            </w:r>
+          </w:p>
+        </w:tc>
+        <w:tc>
+          <w:tcPr>
+            <w:tcW w:type="dxa" w:w="5669"/>
+          </w:tcPr>
+          <w:p>
+            <w:r/>
+            <w:r>
+              <w:rPr>
+                <w:sz w:val="20"/>
+              </w:rPr>
+              <w:t>Enlaces de login y registro sin sesión; saludo y "Cerrar sesión" con sesión; búsqueda que navega a /productos?q=; búsqueda del menú lateral; contador del carrito; categorías.</w:t>
+            </w:r>
+          </w:p>
+        </w:tc>
+      </w:tr>
+      <w:tr>
+        <w:tc>
+          <w:tcPr>
+            <w:tcW w:type="dxa" w:w="3061"/>
+          </w:tcPr>
+          <w:p>
+            <w:r/>
+            <w:r>
+              <w:rPr>
+                <w:sz w:val="20"/>
+              </w:rPr>
+              <w:t>components/ProductoCard.spec.jsx</w:t>
+            </w:r>
+          </w:p>
+        </w:tc>
+        <w:tc>
+          <w:tcPr>
+            <w:tcW w:type="dxa" w:w="680"/>
+          </w:tcPr>
+          <w:p>
+            <w:r/>
+            <w:r>
+              <w:rPr>
+                <w:sz w:val="20"/>
+              </w:rPr>
+              <w:t>7</w:t>
+            </w:r>
+          </w:p>
+        </w:tc>
+        <w:tc>
+          <w:tcPr>
+            <w:tcW w:type="dxa" w:w="5669"/>
+          </w:tcPr>
+          <w:p>
+            <w:r/>
+            <w:r>
+              <w:rPr>
+                <w:sz w:val="20"/>
+              </w:rPr>
+              <w:t>Nombre y precio; etiqueta de oferta con precio anterior y con descuento; clic llama a onAgregar (mock) con el precio que se cobra; aviso de stock; enlace al detalle.</w:t>
+            </w:r>
+          </w:p>
+        </w:tc>
+      </w:tr>
+      <w:tr>
+        <w:tc>
+          <w:tcPr>
+            <w:tcW w:type="dxa" w:w="3061"/>
+          </w:tcPr>
+          <w:p>
+            <w:r/>
+            <w:r>
+              <w:rPr>
+                <w:sz w:val="20"/>
+              </w:rPr>
               <w:t>data/blogs.spec.js</w:t>
             </w:r>
           </w:p>
@@ -2274,7 +3124,7 @@
               <w:rPr>
                 <w:sz w:val="20"/>
               </w:rPr>
-              <w:t>components/ProductoCard.spec.jsx</w:t>
+              <w:t>context/SesionContext.spec.jsx</w:t>
             </w:r>
           </w:p>
         </w:tc>
@@ -2302,7 +3152,7 @@
               <w:rPr>
                 <w:sz w:val="20"/>
               </w:rPr>
-              <w:t>Nombre y precio; etiqueta de oferta con precio anterior y con descuento; clic llama a onAgregar con el precio que se cobra; aviso de stock; enlace al detalle.</w:t>
+              <w:t>Parte sin sesión; iniciarSesion deja al usuario conectado; no guarda la contraseña; cerrarSesion borra lo guardado; recupera la sesión al recargar; datos dañados en localStorage.</w:t>
             </w:r>
           </w:p>
         </w:tc>
@@ -2318,7 +3168,7 @@
               <w:rPr>
                 <w:sz w:val="20"/>
               </w:rPr>
-              <w:t>pages/CompraResultado.spec.jsx</w:t>
+              <w:t>pages/Login.spec.jsx</w:t>
             </w:r>
           </w:p>
         </w:tc>
@@ -2332,7 +3182,7 @@
               <w:rPr>
                 <w:sz w:val="20"/>
               </w:rPr>
-              <w:t>6</w:t>
+              <w:t>5</w:t>
             </w:r>
           </w:p>
         </w:tc>
@@ -2346,7 +3196,51 @@
               <w:rPr>
                 <w:sz w:val="20"/>
               </w:rPr>
-              <w:t>Vista de compra exitosa y de error; motivo del rechazo (monto o stock); datos del cliente y producto; pedido no encontrado.</w:t>
+              <w:t>Login correcto navega al inicio; clave incorrecta muestra error; sin error al inicio; la sesión queda guardada sin la contraseña.</w:t>
+            </w:r>
+          </w:p>
+        </w:tc>
+      </w:tr>
+      <w:tr>
+        <w:tc>
+          <w:tcPr>
+            <w:tcW w:type="dxa" w:w="3061"/>
+          </w:tcPr>
+          <w:p>
+            <w:r/>
+            <w:r>
+              <w:rPr>
+                <w:sz w:val="20"/>
+              </w:rPr>
+              <w:t>components/DireccionFields.spec.jsx</w:t>
+            </w:r>
+          </w:p>
+        </w:tc>
+        <w:tc>
+          <w:tcPr>
+            <w:tcW w:type="dxa" w:w="680"/>
+          </w:tcPr>
+          <w:p>
+            <w:r/>
+            <w:r>
+              <w:rPr>
+                <w:sz w:val="20"/>
+              </w:rPr>
+              <w:t>4</w:t>
+            </w:r>
+          </w:p>
+        </w:tc>
+        <w:tc>
+          <w:tcPr>
+            <w:tcW w:type="dxa" w:w="5669"/>
+          </w:tcPr>
+          <w:p>
+            <w:r/>
+            <w:r>
+              <w:rPr>
+                <w:sz w:val="20"/>
+              </w:rPr>
+              <w:t>Cascada región → comuna: la comuna parte deshabilitada, solo se ofrecen las comunas de la región elegida, al cambiar la región se avisa al padre (mock) y se borra la comuna; la calle también avisa con el nombre del campo.</w:t>
             </w:r>
           </w:p>
         </w:tc>
@@ -2406,50 +3300,6 @@
               <w:rPr>
                 <w:sz w:val="20"/>
               </w:rPr>
-              <w:t>pages/Login.spec.jsx</w:t>
-            </w:r>
-          </w:p>
-        </w:tc>
-        <w:tc>
-          <w:tcPr>
-            <w:tcW w:type="dxa" w:w="680"/>
-          </w:tcPr>
-          <w:p>
-            <w:r/>
-            <w:r>
-              <w:rPr>
-                <w:sz w:val="20"/>
-              </w:rPr>
-              <w:t>3</w:t>
-            </w:r>
-          </w:p>
-        </w:tc>
-        <w:tc>
-          <w:tcPr>
-            <w:tcW w:type="dxa" w:w="5669"/>
-          </w:tcPr>
-          <w:p>
-            <w:r/>
-            <w:r>
-              <w:rPr>
-                <w:sz w:val="20"/>
-              </w:rPr>
-              <w:t>Login correcto navega al inicio; clave incorrecta muestra error; sin error al inicio.</w:t>
-            </w:r>
-          </w:p>
-        </w:tc>
-      </w:tr>
-      <w:tr>
-        <w:tc>
-          <w:tcPr>
-            <w:tcW w:type="dxa" w:w="3061"/>
-          </w:tcPr>
-          <w:p>
-            <w:r/>
-            <w:r>
-              <w:rPr>
-                <w:sz w:val="20"/>
-              </w:rPr>
               <w:t>Total</w:t>
             </w:r>
           </w:p>
@@ -2464,7 +3314,7 @@
               <w:rPr>
                 <w:sz w:val="20"/>
               </w:rPr>
-              <w:t>91</w:t>
+              <w:t>144</w:t>
             </w:r>
           </w:p>
         </w:tc>
@@ -2489,12 +3339,12 @@
         <w:pStyle w:val="Heading1"/>
       </w:pPr>
       <w:r>
-        <w:t>6. Qué falta cubrir y por qué</w:t>
+        <w:t>7. Qué falta cubrir y por qué</w:t>
       </w:r>
     </w:p>
     <w:p>
       <w:r>
-        <w:t>Líneas sin cubrir dentro de los archivos medidos:</w:t>
+        <w:t>Líneas y ramas sin cubrir dentro de los archivos medidos:</w:t>
       </w:r>
     </w:p>
     <w:p>
@@ -2526,7 +3376,7 @@
         <w:pStyle w:val="ListBullet"/>
       </w:pPr>
       <w:r>
-        <w:t>ProductoCard.jsx, línea 54: texto "Sin stock" cuando el producto no tiene unidades. Los productos de prueba tienen stock.</w:t>
+        <w:t>Navbar.jsx, línea 112 (rama): una variante de la condición de la barra de búsqueda que no se ejercita.</w:t>
       </w:r>
     </w:p>
     <w:p>
@@ -2534,7 +3384,15 @@
         <w:pStyle w:val="ListBullet"/>
       </w:pPr>
       <w:r>
-        <w:t>CompraResultado.jsx, líneas 134-140: botones "Imprimir boleta en PDF" y "Enviar boleta por email".</w:t>
+        <w:t>ProductoCard.jsx, línea 54 (rama): texto "Sin stock" cuando el producto no tiene unidades. Los productos de prueba tienen stock.</w:t>
+      </w:r>
+    </w:p>
+    <w:p>
+      <w:pPr>
+        <w:pStyle w:val="ListBullet"/>
+      </w:pPr>
+      <w:r>
+        <w:t>Comprar.jsx, líneas 19-28 (ramas): valores de respaldo cuando la sesión no trae algún dato de dirección.</w:t>
       </w:r>
     </w:p>
     <w:p>
@@ -2547,7 +3405,7 @@
         <w:pStyle w:val="ListBullet"/>
       </w:pPr>
       <w:r>
-        <w:t>Vistas: Home, Productos, ProductoDetalle, Categorias, Ofertas, Nosotros, Blogs, BlogDetalle, Registro, Carrito y Comprar.</w:t>
+        <w:t>Vistas: Home, ProductoDetalle, Categorias, Nosotros, Blogs, BlogDetalle, Registro y Carrito.</w:t>
       </w:r>
     </w:p>
     <w:p>
@@ -2555,7 +3413,7 @@
         <w:pStyle w:val="ListBullet"/>
       </w:pPr>
       <w:r>
-        <w:t>Componentes: Navbar, Footer, CategoriaCard, EquipoSeccion y DireccionFields.</w:t>
+        <w:t>Componentes: Footer, CategoriaCard y EquipoSeccion.</w:t>
       </w:r>
     </w:p>
     <w:p>
@@ -2568,7 +3426,7 @@
     </w:p>
     <w:p>
       <w:r>
-        <w:t>Por eso el 98 % describe la cobertura de los módulos probados, no de todo el proyecto. Las vistas sin pruebas unitarias se verificaron manualmente y con un recorrido automatizado de navegación (login, cascada región-comuna, pago aceptado y rechazado, carrito persistente), pero ese recorrido no forma parte de esta suite.</w:t>
+        <w:t>Por eso el 99 % describe la cobertura de los módulos probados, no de todo el proyecto. Las vistas sin pruebas unitarias se verificaron manualmente y con un recorrido automatizado de navegación (login, búsqueda y filtros, cascada región-comuna, pago aceptado y rechazado, carrito persistente), pero ese recorrido no forma parte de esta suite.</w:t>
       </w:r>
     </w:p>
     <w:p>
@@ -2576,12 +3434,12 @@
         <w:pStyle w:val="Heading1"/>
       </w:pPr>
       <w:r>
-        <w:t>7. Conclusión y próximos pasos</w:t>
+        <w:t>8. Conclusión y próximos pasos</w:t>
       </w:r>
     </w:p>
     <w:p>
       <w:r>
-        <w:t>La lógica del negocio (precios, ofertas, stock, carrito, pasarela de pago, usuarios y pedidos) está probada de forma directa: 91 pruebas pasan y las funciones CRUD tienen cobertura completa en productos, usuarios, blogs, categorías y zonas. Como siguiente paso, se agregarían pruebas para Comprar, Registro, Carrito y Navbar, que son las vistas con más lógica sin cubrir.</w:t>
+        <w:t>La lógica del negocio (precios, ofertas, stock, carrito, sesión, buscador, pasarela de pago, usuarios y pedidos) está probada de forma directa: 144 pruebas pasan y las funciones CRUD tienen cobertura completa en productos, usuarios, blogs, categorías y zonas. Como siguiente paso, se agregarían pruebas para Registro, Carrito y Home, que son las vistas con más lógica sin cubrir.</w:t>
       </w:r>
     </w:p>
     <w:sectPr>

</xml_diff>